<commit_message>
Paper 2 R2.1: reattach five figures; exclude contaminated K-M and old flow
- Fig. 1 game interface (reused from thesis Figure 5.1 artwork)
- Fig. 2 participant flow: thesis's clean regenerated version — the
  original Paper 2 flow diagram has withdrawn statistics baked into the
  image (Cohen's d = 0.78 box, HR = 3.24 banner) and is excluded
- Fig. 3 composite distribution: regenerated clean (old version carried
  threshold-gap and 'improved clinically' annotations)
- Fig. 4 FIDS-FIAS mechanism and Fig. 5 three-arm design: reused as-is
  (clean; Cox in the future design is legitimate with timestamps)
- In-text Fig references added; excluded originals archived with
  EXCLUDED_ prefix for the audit trail

Co-Authored-By: Claude Fable 5 <noreply@anthropic.com>
Claude-Session: https://claude.ai/code/session_01KoT3i8geZspYBMMKVYJUTG
</commit_message>
<xml_diff>
--- a/docs/papers/Paper2_R2_Full_Rewrite.docx
+++ b/docs/papers/Paper2_R2_Full_Rewrite.docx
@@ -784,7 +784,52 @@
     </w:p>
     <w:p>
       <w:r>
-        <w:t>Users navigate a downhill ski run filled with obstacles, steering by weight shift; each full run counts as one session cycle. A pre-session assessment set the initial difficulty low enough for the weakest-balance participant to complete safely, so that the first session could produce an experience of success rather than a de facto fall-risk test. Achievements followed Octalysis Drive 2 (Accomplishment) [21]. Staff were instructed to use phrases such as 'you are practising a new balance skill' in place of 'you are being tested for fall risk'.</w:t>
+        <w:t>Users navigate a downhill ski run filled with obstacles, steering by weight shift; each full run counts as one session cycle. A pre-session assessment set the initial difficulty low enough for the weakest-balance participant to complete safely, so that the first session could produce an experience of success rather than a de facto fall-risk test. Achievements followed Octalysis Drive 2 (Accomplishment) [21] (Fig. 1). Staff were instructed to use phrases such as 'you are practising a new balance skill' in place of 'you are being tested for fall risk'.</w:t>
+      </w:r>
+    </w:p>
+    <w:p>
+      <w:r>
+        <w:drawing>
+          <wp:inline xmlns:a="http://schemas.openxmlformats.org/drawingml/2006/main" xmlns:pic="http://schemas.openxmlformats.org/drawingml/2006/picture">
+            <wp:extent cx="4754880" cy="3076687"/>
+            <wp:docPr id="1" name="Picture 1"/>
+            <wp:cNvGraphicFramePr>
+              <a:graphicFrameLocks noChangeAspect="1"/>
+            </wp:cNvGraphicFramePr>
+            <a:graphic>
+              <a:graphicData uri="http://schemas.openxmlformats.org/drawingml/2006/picture">
+                <pic:pic>
+                  <pic:nvPicPr>
+                    <pic:cNvPr id="0" name="thesis_fig_5_1_image4.png"/>
+                    <pic:cNvPicPr/>
+                  </pic:nvPicPr>
+                  <pic:blipFill>
+                    <a:blip r:embed="rId9"/>
+                    <a:stretch>
+                      <a:fillRect/>
+                    </a:stretch>
+                  </pic:blipFill>
+                  <pic:spPr>
+                    <a:xfrm>
+                      <a:off x="0" y="0"/>
+                      <a:ext cx="4754880" cy="3076687"/>
+                    </a:xfrm>
+                    <a:prstGeom prst="rect"/>
+                  </pic:spPr>
+                </pic:pic>
+              </a:graphicData>
+            </a:graphic>
+          </wp:inline>
+        </w:drawing>
+      </w:r>
+    </w:p>
+    <w:p>
+      <w:r>
+        <w:rPr>
+          <w:i/>
+          <w:sz w:val="18"/>
+        </w:rPr>
+        <w:t>Fig. 1. The gamified skiing interface deployed on the InBody balance panel. The user steers the on-screen skier by shifting body weight laterally on the pressure-sensitive panel; each lateral shift is simultaneously logged as Centre-of-Pressure (COP) coordinates for clinical fall-risk analysis. The dual-purpose design allows a standard FRA measurement to occur within a game context.</w:t>
       </w:r>
     </w:p>
     <w:p>
@@ -1468,7 +1513,52 @@
     </w:tbl>
     <w:p>
       <w:r>
-        <w:t>The cycle distribution was: eight participants completed one cycle, seven completed two, six reached three, one reached four, five reached five, and three reached six. The most telling figure is the zero re-engagement count: of the 21 participants who disengaged, not one returned within the eight-week window. This absolute permanence distinguishes the pattern from typical usage attrition, in which some users return [7]. The 26.7% single-session exit rate marks the first session as the highest-risk point. No time-to-event model is reported: the archive preserves cycle counts, not timestamps. The evidential core of the pattern is carried by the three directly observed quantities in Table III and by the satisfaction association above.</w:t>
+        <w:t>The cycle distribution was: eight participants completed one cycle, seven completed two, six reached three, one reached four, five reached five, and three reached six. The most telling figure is the zero re-engagement count: of the 21 participants who disengaged, not one returned within the eight-week window. This absolute permanence distinguishes the pattern from typical usage attrition, in which some users return [7]. The 26.7% single-session exit rate marks the first session as the highest-risk point (Fig. 2). No time-to-event model is reported: the archive preserves cycle counts, not timestamps. The evidential core of the pattern is carried by the three directly observed quantities in Table III and by the satisfaction association above.</w:t>
+      </w:r>
+    </w:p>
+    <w:p>
+      <w:r>
+        <w:drawing>
+          <wp:inline xmlns:a="http://schemas.openxmlformats.org/drawingml/2006/main" xmlns:pic="http://schemas.openxmlformats.org/drawingml/2006/picture">
+            <wp:extent cx="4754880" cy="3039792"/>
+            <wp:docPr id="2" name="Picture 2"/>
+            <wp:cNvGraphicFramePr>
+              <a:graphicFrameLocks noChangeAspect="1"/>
+            </wp:cNvGraphicFramePr>
+            <a:graphic>
+              <a:graphicData uri="http://schemas.openxmlformats.org/drawingml/2006/picture">
+                <pic:pic>
+                  <pic:nvPicPr>
+                    <pic:cNvPr id="0" name="thesis_fig_5_5.png"/>
+                    <pic:cNvPicPr/>
+                  </pic:nvPicPr>
+                  <pic:blipFill>
+                    <a:blip r:embed="rId10"/>
+                    <a:stretch>
+                      <a:fillRect/>
+                    </a:stretch>
+                  </pic:blipFill>
+                  <pic:spPr>
+                    <a:xfrm>
+                      <a:off x="0" y="0"/>
+                      <a:ext cx="4754880" cy="3039792"/>
+                    </a:xfrm>
+                    <a:prstGeom prst="rect"/>
+                  </pic:spPr>
+                </pic:pic>
+              </a:graphicData>
+            </a:graphic>
+          </wp:inline>
+        </w:drawing>
+      </w:r>
+    </w:p>
+    <w:p>
+      <w:r>
+        <w:rPr>
+          <w:i/>
+          <w:sz w:val="18"/>
+        </w:rPr>
+        <w:t>Fig. 2. Participant flow diagram (N = 30). Twenty-one participants disengaged at or before three cycles, including eight single-session exits; six formed the F4 abandonment cluster, of whom three recorded an improved FRA index in their only session and still never returned. No re-engagement after disengagement was observed (0 of 21).</w:t>
       </w:r>
     </w:p>
     <w:p>
@@ -2229,7 +2319,52 @@
     </w:tbl>
     <w:p>
       <w:r>
-        <w:t>The empty interval between scores 5 and 9 is not read as evidence of a behavioural threshold: given the construction, it may be a mechanical effect of the scoring thresholds and outcome-linked items, or sampling variation in a cohort of thirty. What matters about the F4 group does not depend on the composite: three of its six members recorded a positive FRA index change in their single session and did not return. That divergence between recorded improvement and return behaviour challenges a purely clinical explanation of dropout and is the observation that most clearly motivates the identity-level account of the Discussion.</w:t>
+        <w:t>The empty interval between scores 5 and 9 is not read as evidence of a behavioural threshold: given the construction, it may be a mechanical effect of the scoring thresholds and outcome-linked items, or sampling variation in a cohort of thirty. What matters about the F4 group does not depend on the composite: three of its six members recorded a positive FRA index change in their single session and did not return. That divergence between recorded improvement and return behaviour challenges a purely clinical explanation of dropout and is the observation that most clearly motivates the identity-level account of the Discussion. (Fig. 3).</w:t>
+      </w:r>
+    </w:p>
+    <w:p>
+      <w:r>
+        <w:drawing>
+          <wp:inline xmlns:a="http://schemas.openxmlformats.org/drawingml/2006/main" xmlns:pic="http://schemas.openxmlformats.org/drawingml/2006/picture">
+            <wp:extent cx="4754880" cy="2806386"/>
+            <wp:docPr id="3" name="Picture 3"/>
+            <wp:cNvGraphicFramePr>
+              <a:graphicFrameLocks noChangeAspect="1"/>
+            </wp:cNvGraphicFramePr>
+            <a:graphic>
+              <a:graphicData uri="http://schemas.openxmlformats.org/drawingml/2006/picture">
+                <pic:pic>
+                  <pic:nvPicPr>
+                    <pic:cNvPr id="0" name="p2R2_fig3_distribution.png"/>
+                    <pic:cNvPicPr/>
+                  </pic:nvPicPr>
+                  <pic:blipFill>
+                    <a:blip r:embed="rId11"/>
+                    <a:stretch>
+                      <a:fillRect/>
+                    </a:stretch>
+                  </pic:blipFill>
+                  <pic:spPr>
+                    <a:xfrm>
+                      <a:off x="0" y="0"/>
+                      <a:ext cx="4754880" cy="2806386"/>
+                    </a:xfrm>
+                    <a:prstGeom prst="rect"/>
+                  </pic:spPr>
+                </pic:pic>
+              </a:graphicData>
+            </a:graphic>
+          </wp:inline>
+        </w:drawing>
+      </w:r>
+    </w:p>
+    <w:p>
+      <w:r>
+        <w:rPr>
+          <w:i/>
+          <w:sz w:val="18"/>
+        </w:rPr>
+        <w:t>Fig. 3. Distribution of provisional FIAS composite scores (N = 30). The composite includes engagement-outcome attributes, so the separation of the F4 cluster is expected by construction; the figure is descriptive case identification, not evidence, and the empty interval between scores 5 and 9 is not read as a behavioural threshold.</w:t>
       </w:r>
     </w:p>
     <w:p>
@@ -2723,7 +2858,52 @@
     </w:p>
     <w:p>
       <w:r>
-        <w:t>The proposed mechanism has two steps: FIDS names the initial dropout — first failure collapses task self-efficacy and the participant withdraws; FIAS names the consolidation — loss aversion makes re-engagement a gamble on further unwelcome evidence about one's own body, so the participant never returns. H1-H4 operationalise the account. Field observation during the deployment was consistent with it: participants who spoke about the activity in learning terms tended to sustain engagement, while those who spoke in health-deficit terms tended to exit early. Because the week-2 classification that formalised this observation was withdrawn (Section VII-A), the pattern is reported as a field observation and a hypothesis for the confirmatory study, not as a measured effect.</w:t>
+        <w:t>The proposed mechanism has two steps: FIDS names the initial dropout — first failure collapses task self-efficacy and the participant withdraws; FIAS names the consolidation — loss aversion makes re-engagement a gamble on further unwelcome evidence about one's own body, so the participant never returns. H1-H4 operationalise the account (Fig. 4). Field observation during the deployment was consistent with it: participants who spoke about the activity in learning terms tended to sustain engagement, while those who spoke in health-deficit terms tended to exit early. Because the week-2 classification that formalised this observation was withdrawn (Section VII-A), the pattern is reported as a field observation and a hypothesis for the confirmatory study, not as a measured effect.</w:t>
+      </w:r>
+    </w:p>
+    <w:p>
+      <w:r>
+        <w:drawing>
+          <wp:inline xmlns:a="http://schemas.openxmlformats.org/drawingml/2006/main" xmlns:pic="http://schemas.openxmlformats.org/drawingml/2006/picture">
+            <wp:extent cx="4754880" cy="5714551"/>
+            <wp:docPr id="4" name="Picture 4"/>
+            <wp:cNvGraphicFramePr>
+              <a:graphicFrameLocks noChangeAspect="1"/>
+            </wp:cNvGraphicFramePr>
+            <a:graphic>
+              <a:graphicData uri="http://schemas.openxmlformats.org/drawingml/2006/picture">
+                <pic:pic>
+                  <pic:nvPicPr>
+                    <pic:cNvPr id="0" name="p2_fig5_mechanism.png"/>
+                    <pic:cNvPicPr/>
+                  </pic:nvPicPr>
+                  <pic:blipFill>
+                    <a:blip r:embed="rId12"/>
+                    <a:stretch>
+                      <a:fillRect/>
+                    </a:stretch>
+                  </pic:blipFill>
+                  <pic:spPr>
+                    <a:xfrm>
+                      <a:off x="0" y="0"/>
+                      <a:ext cx="4754880" cy="5714551"/>
+                    </a:xfrm>
+                    <a:prstGeom prst="rect"/>
+                  </pic:spPr>
+                </pic:pic>
+              </a:graphicData>
+            </a:graphic>
+          </wp:inline>
+        </w:drawing>
+      </w:r>
+    </w:p>
+    <w:p>
+      <w:r>
+        <w:rPr>
+          <w:i/>
+          <w:sz w:val="18"/>
+        </w:rPr>
+        <w:t>Fig. 4. Conceptual model of the proposed FIDS-FIAS mechanism and intervention pathways. The left pathway shows the hypothesised failure cascade: a first failure event collapses self-efficacy (FIDS), after which loss aversion — via an endowment-protective reading of the failure — consolidates permanent withdrawal (FIAS). The dashed elements show the two intervention routes for confirmatory testing: domain reframing (H5), which aims to prevent the identity threat from attaching, and the coaching layer, which aims to repair self-efficacy after activation. The mechanism is proposed, not directly measured.</w:t>
       </w:r>
     </w:p>
     <w:p>
@@ -2814,7 +2994,52 @@
     </w:p>
     <w:p>
       <w:r>
-        <w:t>The confirmatory study marks the shift from exploratory action research to a pre-registered design. Arm 1 (control): the FRA-coupled game, framed explicitly as fall risk assessment, replicating the present conditions. Arm 2 (domain reframing): identical game, hardware and adaptation, framed as an instant response test with no health-assessment language; background FRA capture disclosed as in Section XI-D. Arm 3 (coaching): the FRA-coupled condition plus the coaching layer of Section VI-D. Arm 1 versus Arm 2 tests whether preventing the identity threat works (H5); Arm 1 versus Arm 3 tests whether repairing it after activation works (H1-H4). A pilot (n = 15-25) precedes a two-site study (n = 60-80) with stratified sampling by age band and baseline FES-I, randomised allocation, and baseline measures including cognitive status (MoCA), PHQ-4, technology familiarity, fall history and a validated motivational measure administered before any outcome is observed. The primary outcome is re-engagement attempt within seven days of first failure. Secondary outcomes include the FRA index, FES-I, satisfaction, three-month fall rate, EQ-5D-5L and staff time. Reporting follows STROBE [42] and SPIRIT-AI [43]; WHO and regulator guidance on AI in health informs the AI component [44], [45]. All hypotheses (H1-H5) and endpoints will be pre-registered before data collection.</w:t>
+        <w:t>The confirmatory study marks the shift from exploratory action research to a pre-registered design. Arm 1 (control): the FRA-coupled game, framed explicitly as fall risk assessment, replicating the present conditions. Arm 2 (domain reframing): identical game, hardware and adaptation, framed as an instant response test with no health-assessment language; background FRA capture disclosed as in Section XI-D. Arm 3 (coaching): the FRA-coupled condition plus the coaching layer of Section VI-D. Arm 1 versus Arm 2 tests whether preventing the identity threat works (H5); Arm 1 versus Arm 3 tests whether repairing it after activation works (H1-H4) (Fig. 5). A pilot (n = 15-25) precedes a two-site study (n = 60-80) with stratified sampling by age band and baseline FES-I, randomised allocation, and baseline measures including cognitive status (MoCA), PHQ-4, technology familiarity, fall history and a validated motivational measure administered before any outcome is observed. The primary outcome is re-engagement attempt within seven days of first failure. Secondary outcomes include the FRA index, FES-I, satisfaction, three-month fall rate, EQ-5D-5L and staff time. Reporting follows STROBE [42] and SPIRIT-AI [43]; WHO and regulator guidance on AI in health informs the AI component [44], [45]. All hypotheses (H1-H5) and endpoints will be pre-registered before data collection.</w:t>
+      </w:r>
+    </w:p>
+    <w:p>
+      <w:r>
+        <w:drawing>
+          <wp:inline xmlns:a="http://schemas.openxmlformats.org/drawingml/2006/main" xmlns:pic="http://schemas.openxmlformats.org/drawingml/2006/picture">
+            <wp:extent cx="4754880" cy="4274589"/>
+            <wp:docPr id="5" name="Picture 5"/>
+            <wp:cNvGraphicFramePr>
+              <a:graphicFrameLocks noChangeAspect="1"/>
+            </wp:cNvGraphicFramePr>
+            <a:graphic>
+              <a:graphicData uri="http://schemas.openxmlformats.org/drawingml/2006/picture">
+                <pic:pic>
+                  <pic:nvPicPr>
+                    <pic:cNvPr id="0" name="p2_fig6_threearm.png"/>
+                    <pic:cNvPicPr/>
+                  </pic:nvPicPr>
+                  <pic:blipFill>
+                    <a:blip r:embed="rId13"/>
+                    <a:stretch>
+                      <a:fillRect/>
+                    </a:stretch>
+                  </pic:blipFill>
+                  <pic:spPr>
+                    <a:xfrm>
+                      <a:off x="0" y="0"/>
+                      <a:ext cx="4754880" cy="4274589"/>
+                    </a:xfrm>
+                    <a:prstGeom prst="rect"/>
+                  </pic:spPr>
+                </pic:pic>
+              </a:graphicData>
+            </a:graphic>
+          </wp:inline>
+        </w:drawing>
+      </w:r>
+    </w:p>
+    <w:p>
+      <w:r>
+        <w:rPr>
+          <w:i/>
+          <w:sz w:val="18"/>
+        </w:rPr>
+        <w:t>Fig. 5. Three-arm confirmatory study design. Arm 1 (control) replicates the present FRA-coupled conditions; Arm 2 (domain reframing) uses the identical game framed as a reaction-speed challenge, testing H5; Arm 3 adds the staff coaching layer to the FRA-coupled condition, testing H1-H4. Time-to-re-engagement analysis is supportable in this design because session-level logging with timestamps is pre-specified.</w:t>
       </w:r>
     </w:p>
     <w:p>

</xml_diff>